<commit_message>
Fix: exclude archive_* from reshape; finalize examiner-required layout
</commit_message>
<xml_diff>
--- a/Machine-Learning-for-Identifying-Fraudulent-Calls-Keng-Seng.docx
+++ b/Machine-Learning-for-Identifying-Fraudulent-Calls-Keng-Seng.docx
@@ -18,14 +18,39 @@
         </w:rPr>
         <w:t>Purpose of the Project and Its Significance</w:t>
       </w:r>
-    </w:p>
-    <w:p>
-      <w:pPr>
-        <w:rPr>
-          <w:i/>
-          <w:iCs/>
-        </w:rPr>
-      </w:pPr>
+      <w:r>
+        <w:rPr>
+          <w:b/>
+          <w:bCs/>
+          <w:i/>
+          <w:iCs/>
+        </w:rPr>
+        <w:br/>
+      </w:r>
+      <w:hyperlink r:id="rId7" w:history="1">
+        <w:r>
+          <w:rPr>
+            <w:rStyle w:val="Hyperlink"/>
+            <w:i/>
+            <w:iCs/>
+          </w:rPr>
+          <w:t>https://github.com/kengsengwang/Machine-Learning-for-Identifying-Fraudulent-Calls</w:t>
+        </w:r>
+      </w:hyperlink>
+      <w:r>
+        <w:rPr>
+          <w:i/>
+          <w:iCs/>
+        </w:rPr>
+        <w:br/>
+      </w:r>
+      <w:r>
+        <w:rPr>
+          <w:i/>
+          <w:iCs/>
+        </w:rPr>
+        <w:br/>
+      </w:r>
       <w:r>
         <w:rPr>
           <w:i/>
@@ -46,23 +71,7 @@
           <w:i/>
           <w:iCs/>
         </w:rPr>
-        <w:t xml:space="preserve">Machine learning techniques have proven to be highly effective in combating fraud by </w:t>
-      </w:r>
-      <w:proofErr w:type="spellStart"/>
-      <w:r>
-        <w:rPr>
-          <w:i/>
-          <w:iCs/>
-        </w:rPr>
-        <w:t>analyzing</w:t>
-      </w:r>
-      <w:proofErr w:type="spellEnd"/>
-      <w:r>
-        <w:rPr>
-          <w:i/>
-          <w:iCs/>
-        </w:rPr>
-        <w:t xml:space="preserve"> historical data, identifying suspicious patterns, and flagging potentially fraudulent activities for further investigation. This approach aligns with the Singapore Government's ongoing efforts to address industry challenges through innovative solutions, making this project both timely and impactful.</w:t>
+        <w:t>Machine learning techniques have proven to be highly effective in combating fraud by analyzing historical data, identifying suspicious patterns, and flagging potentially fraudulent activities for further investigation. This approach aligns with the Singapore Government's ongoing efforts to address industry challenges through innovative solutions, making this project both timely and impactful.</w:t>
       </w:r>
     </w:p>
     <w:p>
@@ -158,7 +167,6 @@
           <w:i/>
           <w:iCs/>
         </w:rPr>
-        <w:lastRenderedPageBreak/>
         <w:t>Detailed Overview of the System Architecture</w:t>
       </w:r>
     </w:p>
@@ -261,39 +269,7 @@
           <w:iCs/>
         </w:rPr>
         <w:br/>
-        <w:t xml:space="preserve">Tools like </w:t>
-      </w:r>
-      <w:proofErr w:type="spellStart"/>
-      <w:r>
-        <w:rPr>
-          <w:i/>
-          <w:iCs/>
-        </w:rPr>
-        <w:t>MLflow</w:t>
-      </w:r>
-      <w:proofErr w:type="spellEnd"/>
-      <w:r>
-        <w:rPr>
-          <w:i/>
-          <w:iCs/>
-        </w:rPr>
-        <w:t xml:space="preserve"> are used to track training runs, log model parameters, and record key performance metrics, including accuracy, precision, recall, F1-score, and ROC AUC. This allows the team to maintain a history of experiments, compare model performance, and identify the best models for deployment. </w:t>
-      </w:r>
-      <w:proofErr w:type="spellStart"/>
-      <w:r>
-        <w:rPr>
-          <w:i/>
-          <w:iCs/>
-        </w:rPr>
-        <w:t>MLflow</w:t>
-      </w:r>
-      <w:proofErr w:type="spellEnd"/>
-      <w:r>
-        <w:rPr>
-          <w:i/>
-          <w:iCs/>
-        </w:rPr>
-        <w:t xml:space="preserve"> also provides a versioning system for managing multiple model versions, facilitating seamless model promotion for real-time inference.</w:t>
+        <w:t>Tools like MLflow are used to track training runs, log model parameters, and record key performance metrics, including accuracy, precision, recall, F1-score, and ROC AUC. This allows the team to maintain a history of experiments, compare model performance, and identify the best models for deployment. MLflow also provides a versioning system for managing multiple model versions, facilitating seamless model promotion for real-time inference.</w:t>
       </w:r>
     </w:p>
     <w:p>
@@ -309,7 +285,7 @@
           <w:iCs/>
         </w:rPr>
         <w:pict w14:anchorId="03202828">
-          <v:rect id="_x0000_i1031" style="width:0;height:1.5pt" o:hralign="center" o:hrstd="t" o:hr="t" fillcolor="#a0a0a0" stroked="f"/>
+          <v:rect id="_x0000_i1025" style="width:0;height:1.5pt" o:hralign="center" o:hrstd="t" o:hr="t" fillcolor="#a0a0a0" stroked="f"/>
         </w:pict>
       </w:r>
     </w:p>
@@ -387,7 +363,6 @@
           <w:i/>
           <w:iCs/>
         </w:rPr>
-        <w:lastRenderedPageBreak/>
         <w:t>Key Aspects of the Codebase</w:t>
       </w:r>
     </w:p>
@@ -403,23 +378,7 @@
           <w:i/>
           <w:iCs/>
         </w:rPr>
-        <w:t>The codebase for this project, implemented in Python scripts (.</w:t>
-      </w:r>
-      <w:proofErr w:type="spellStart"/>
-      <w:r>
-        <w:rPr>
-          <w:i/>
-          <w:iCs/>
-        </w:rPr>
-        <w:t>py</w:t>
-      </w:r>
-      <w:proofErr w:type="spellEnd"/>
-      <w:r>
-        <w:rPr>
-          <w:i/>
-          <w:iCs/>
-        </w:rPr>
-        <w:t>), covers several critical components:</w:t>
+        <w:t>The codebase for this project, implemented in Python scripts (.py), covers several critical components:</w:t>
       </w:r>
     </w:p>
     <w:p>
@@ -448,23 +407,7 @@
           <w:iCs/>
         </w:rPr>
         <w:br/>
-        <w:t xml:space="preserve">The project starts with data ingestion, where the provided dataset is accessed and </w:t>
-      </w:r>
-      <w:proofErr w:type="spellStart"/>
-      <w:r>
-        <w:rPr>
-          <w:i/>
-          <w:iCs/>
-        </w:rPr>
-        <w:t>preprocessed</w:t>
-      </w:r>
-      <w:proofErr w:type="spellEnd"/>
-      <w:r>
-        <w:rPr>
-          <w:i/>
-          <w:iCs/>
-        </w:rPr>
-        <w:t>. This often includes converting raw data from databases (e.g., SQLite or MongoDB) to more convenient formats like CSV. ChatGPT was used to assist in this data conversion and cleanup, transforming the raw data into structured CSV files for easier processing. The choice to use ChatGPT for this task reflects the need for rapid, automated data cleaning, especially when dealing with large, unstructured datasets.</w:t>
+        <w:t>The project starts with data ingestion, where the provided dataset is accessed and preprocessed. This often includes converting raw data from databases (e.g., SQLite or MongoDB) to more convenient formats like CSV. ChatGPT was used to assist in this data conversion and cleanup, transforming the raw data into structured CSV files for easier processing. The choice to use ChatGPT for this task reflects the need for rapid, automated data cleaning, especially when dealing with large, unstructured datasets.</w:t>
       </w:r>
     </w:p>
     <w:p>
@@ -533,17 +476,177 @@
           <w:i/>
           <w:iCs/>
         </w:rPr>
-        <w:t xml:space="preserve">The model training process involves several critical steps to ensure accurate and robust fraud detection. It begins with splitting the dataset into training and testing sets, typically in a 70/30 ratio, to evaluate model performance on unseen data. The training phase includes implementing a range of machine learning models, such as Logistic Regression, Random Forest, </w:t>
-      </w:r>
-      <w:proofErr w:type="spellStart"/>
-      <w:r>
-        <w:rPr>
-          <w:i/>
-          <w:iCs/>
-        </w:rPr>
-        <w:t>XGBoost</w:t>
-      </w:r>
-      <w:proofErr w:type="spellEnd"/>
+        <w:t>The model training process involves several critical steps to ensure accurate and robust fraud detection. It begins with splitting the dataset into training and testing sets, typically in a 70/30 ratio, to evaluate model performance on unseen data. The training phase includes implementing a range of machine learning models, such as Logistic Regression, Random Forest, XGBoost, and LightGBM, each chosen for their suitability in handling structured data and complex decision boundaries.</w:t>
+      </w:r>
+    </w:p>
+    <w:p>
+      <w:pPr>
+        <w:rPr>
+          <w:i/>
+          <w:iCs/>
+        </w:rPr>
+      </w:pPr>
+      <w:r>
+        <w:rPr>
+          <w:i/>
+          <w:iCs/>
+        </w:rPr>
+        <w:t xml:space="preserve">Given the significant class imbalance often present in fraud datasets, techniques like </w:t>
+      </w:r>
+      <w:r>
+        <w:rPr>
+          <w:b/>
+          <w:bCs/>
+          <w:i/>
+          <w:iCs/>
+        </w:rPr>
+        <w:t>SMOTE (Synthetic Minority Over-sampling Technique)</w:t>
+      </w:r>
+      <w:r>
+        <w:rPr>
+          <w:i/>
+          <w:iCs/>
+        </w:rPr>
+        <w:t xml:space="preserve"> may be employed to balance the distribution of classes, ensuring the models can effectively learn the minority (fraud) class. Additionally, the training process can incorporate hyperparameter tuning to optimize model performance. This may involve grid search, random search, or more advanced techniques like Bayesian optimization.</w:t>
+      </w:r>
+    </w:p>
+    <w:p>
+      <w:pPr>
+        <w:rPr>
+          <w:i/>
+          <w:iCs/>
+        </w:rPr>
+      </w:pPr>
+      <w:r>
+        <w:rPr>
+          <w:i/>
+          <w:iCs/>
+        </w:rPr>
+        <w:t xml:space="preserve">To facilitate experiment tracking and model versioning, libraries like </w:t>
+      </w:r>
+      <w:r>
+        <w:rPr>
+          <w:b/>
+          <w:bCs/>
+          <w:i/>
+          <w:iCs/>
+        </w:rPr>
+        <w:t>MLflow</w:t>
+      </w:r>
+      <w:r>
+        <w:rPr>
+          <w:i/>
+          <w:iCs/>
+        </w:rPr>
+        <w:t xml:space="preserve"> can be integrated into the training code. This allows for logging key parameters, metrics, and model artifacts, providing a comprehensive record of each training run for future reference and comparison.</w:t>
+      </w:r>
+    </w:p>
+    <w:p>
+      <w:pPr>
+        <w:rPr>
+          <w:i/>
+          <w:iCs/>
+        </w:rPr>
+      </w:pPr>
+      <w:r>
+        <w:rPr>
+          <w:i/>
+          <w:iCs/>
+        </w:rPr>
+        <w:lastRenderedPageBreak/>
+        <w:pict w14:anchorId="2FFEEE2F">
+          <v:rect id="_x0000_i1026" style="width:0;height:1.5pt" o:hralign="center" o:hrstd="t" o:hr="t" fillcolor="#a0a0a0" stroked="f"/>
+        </w:pict>
+      </w:r>
+    </w:p>
+    <w:p>
+      <w:pPr>
+        <w:rPr>
+          <w:i/>
+          <w:iCs/>
+        </w:rPr>
+      </w:pPr>
+      <w:r>
+        <w:rPr>
+          <w:b/>
+          <w:bCs/>
+          <w:i/>
+          <w:iCs/>
+        </w:rPr>
+        <w:t>Model Evaluation Process</w:t>
+      </w:r>
+    </w:p>
+    <w:p>
+      <w:pPr>
+        <w:rPr>
+          <w:i/>
+          <w:iCs/>
+        </w:rPr>
+      </w:pPr>
+      <w:r>
+        <w:rPr>
+          <w:i/>
+          <w:iCs/>
+        </w:rPr>
+        <w:t xml:space="preserve">Evaluating the trained models requires a thoughtful approach, particularly when dealing with imbalanced data. Simple accuracy is often insufficient, as it can be misleading in cases where the majority class dominates the dataset. Instead, the evaluation process should include metrics like </w:t>
+      </w:r>
+      <w:r>
+        <w:rPr>
+          <w:b/>
+          <w:bCs/>
+          <w:i/>
+          <w:iCs/>
+        </w:rPr>
+        <w:t>Precision</w:t>
+      </w:r>
+      <w:r>
+        <w:rPr>
+          <w:i/>
+          <w:iCs/>
+        </w:rPr>
+        <w:t xml:space="preserve">, </w:t>
+      </w:r>
+      <w:r>
+        <w:rPr>
+          <w:b/>
+          <w:bCs/>
+          <w:i/>
+          <w:iCs/>
+        </w:rPr>
+        <w:t>Recall</w:t>
+      </w:r>
+      <w:r>
+        <w:rPr>
+          <w:i/>
+          <w:iCs/>
+        </w:rPr>
+        <w:t xml:space="preserve">, </w:t>
+      </w:r>
+      <w:r>
+        <w:rPr>
+          <w:b/>
+          <w:bCs/>
+          <w:i/>
+          <w:iCs/>
+        </w:rPr>
+        <w:t>F1-Score</w:t>
+      </w:r>
+      <w:r>
+        <w:rPr>
+          <w:i/>
+          <w:iCs/>
+        </w:rPr>
+        <w:t xml:space="preserve">, </w:t>
+      </w:r>
+      <w:r>
+        <w:rPr>
+          <w:b/>
+          <w:bCs/>
+          <w:i/>
+          <w:iCs/>
+        </w:rPr>
+        <w:t>Confusion Matrix</w:t>
+      </w:r>
       <w:r>
         <w:rPr>
           <w:i/>
@@ -551,101 +654,122 @@
         </w:rPr>
         <w:t xml:space="preserve">, and </w:t>
       </w:r>
-      <w:proofErr w:type="spellStart"/>
-      <w:r>
-        <w:rPr>
-          <w:i/>
-          <w:iCs/>
-        </w:rPr>
-        <w:t>LightGBM</w:t>
-      </w:r>
-      <w:proofErr w:type="spellEnd"/>
-      <w:r>
-        <w:rPr>
-          <w:i/>
-          <w:iCs/>
-        </w:rPr>
-        <w:t>, each chosen for their suitability in handling structured data and complex decision boundaries.</w:t>
-      </w:r>
-    </w:p>
-    <w:p>
-      <w:pPr>
-        <w:rPr>
-          <w:i/>
-          <w:iCs/>
-        </w:rPr>
-      </w:pPr>
-      <w:r>
-        <w:rPr>
-          <w:i/>
-          <w:iCs/>
-        </w:rPr>
-        <w:t xml:space="preserve">Given the significant class imbalance often present in fraud datasets, techniques like </w:t>
-      </w:r>
-      <w:r>
-        <w:rPr>
-          <w:b/>
-          <w:bCs/>
-          <w:i/>
-          <w:iCs/>
-        </w:rPr>
-        <w:t>SMOTE (Synthetic Minority Over-sampling Technique)</w:t>
-      </w:r>
-      <w:r>
-        <w:rPr>
-          <w:i/>
-          <w:iCs/>
-        </w:rPr>
-        <w:t xml:space="preserve"> may be employed to balance the distribution of classes, ensuring the models can effectively learn the minority (fraud) class. Additionally, the training process can incorporate hyperparameter tuning to optimize model performance. This may involve grid search, random search, or more advanced techniques like Bayesian optimization.</w:t>
-      </w:r>
-    </w:p>
-    <w:p>
-      <w:pPr>
-        <w:rPr>
-          <w:i/>
-          <w:iCs/>
-        </w:rPr>
-      </w:pPr>
-      <w:r>
-        <w:rPr>
-          <w:i/>
-          <w:iCs/>
-        </w:rPr>
-        <w:t xml:space="preserve">To facilitate experiment tracking and model versioning, libraries like </w:t>
-      </w:r>
-      <w:proofErr w:type="spellStart"/>
-      <w:r>
-        <w:rPr>
-          <w:b/>
-          <w:bCs/>
-          <w:i/>
-          <w:iCs/>
-        </w:rPr>
-        <w:t>MLflow</w:t>
-      </w:r>
-      <w:proofErr w:type="spellEnd"/>
-      <w:r>
-        <w:rPr>
-          <w:i/>
-          <w:iCs/>
-        </w:rPr>
-        <w:t xml:space="preserve"> can be integrated into the training code. This allows for logging key parameters, metrics, and model artifacts, providing a comprehensive record of each training run for future reference and comparison.</w:t>
-      </w:r>
-    </w:p>
-    <w:p>
-      <w:pPr>
-        <w:rPr>
-          <w:i/>
-          <w:iCs/>
-        </w:rPr>
-      </w:pPr>
-      <w:r>
-        <w:rPr>
-          <w:i/>
-          <w:iCs/>
-        </w:rPr>
-        <w:pict w14:anchorId="2FFEEE2F">
-          <v:rect id="_x0000_i1039" style="width:0;height:1.5pt" o:hralign="center" o:hrstd="t" o:hr="t" fillcolor="#a0a0a0" stroked="f"/>
+      <w:r>
+        <w:rPr>
+          <w:b/>
+          <w:bCs/>
+          <w:i/>
+          <w:iCs/>
+        </w:rPr>
+        <w:t>ROC AUC (Receiver Operating Characteristic Area Under the Curve)</w:t>
+      </w:r>
+      <w:r>
+        <w:rPr>
+          <w:i/>
+          <w:iCs/>
+        </w:rPr>
+        <w:t>. These metrics provide a more comprehensive understanding of the model’s performance, capturing both the ability to identify positive cases (fraud) and the trade-off between precision and recall.</w:t>
+      </w:r>
+    </w:p>
+    <w:p>
+      <w:pPr>
+        <w:rPr>
+          <w:i/>
+          <w:iCs/>
+        </w:rPr>
+      </w:pPr>
+      <w:r>
+        <w:rPr>
+          <w:i/>
+          <w:iCs/>
+        </w:rPr>
+        <w:t xml:space="preserve">The evaluation code should generate these metrics based on predictions made on the test set and include visual aids like </w:t>
+      </w:r>
+      <w:r>
+        <w:rPr>
+          <w:b/>
+          <w:bCs/>
+          <w:i/>
+          <w:iCs/>
+        </w:rPr>
+        <w:t>ROC curves</w:t>
+      </w:r>
+      <w:r>
+        <w:rPr>
+          <w:i/>
+          <w:iCs/>
+        </w:rPr>
+        <w:t xml:space="preserve"> and </w:t>
+      </w:r>
+      <w:r>
+        <w:rPr>
+          <w:b/>
+          <w:bCs/>
+          <w:i/>
+          <w:iCs/>
+        </w:rPr>
+        <w:t>Precision-Recall curves</w:t>
+      </w:r>
+      <w:r>
+        <w:rPr>
+          <w:i/>
+          <w:iCs/>
+        </w:rPr>
+        <w:t xml:space="preserve"> to illustrate model performance more effectively. This approach not only demonstrates the model’s predictive power but also provides insights into potential overfitting, underfitting, and overall generalization capability.</w:t>
+      </w:r>
+      <w:r>
+        <w:rPr>
+          <w:i/>
+          <w:iCs/>
+        </w:rPr>
+        <w:br/>
+      </w:r>
+      <w:r>
+        <w:rPr>
+          <w:i/>
+          <w:iCs/>
+        </w:rPr>
+        <w:br/>
+      </w:r>
+      <w:r>
+        <w:rPr>
+          <w:b/>
+          <w:bCs/>
+          <w:i/>
+          <w:iCs/>
+        </w:rPr>
+        <w:t>Pipeline Orchestration Logic</w:t>
+      </w:r>
+    </w:p>
+    <w:p>
+      <w:pPr>
+        <w:rPr>
+          <w:i/>
+          <w:iCs/>
+        </w:rPr>
+      </w:pPr>
+      <w:r>
+        <w:rPr>
+          <w:i/>
+          <w:iCs/>
+        </w:rPr>
+        <w:t>The pipeline orchestration logic defines the sequence of steps required to build a complete machine learning pipeline, including data loading, cleaning, feature engineering, model training, and evaluation. This is typically implemented in Python scripts, with an emphasis on clean code practices to ensure readability, reusability, and maintainability. Using functions and classes is highly recommended to improve code organization, reduce duplication, and facilitate testing. This approach makes the codebase easier to extend and debug, which is essential for real-world machine learning applications.</w:t>
+      </w:r>
+    </w:p>
+    <w:p>
+      <w:pPr>
+        <w:rPr>
+          <w:i/>
+          <w:iCs/>
+        </w:rPr>
+      </w:pPr>
+      <w:r>
+        <w:rPr>
+          <w:i/>
+          <w:iCs/>
+        </w:rPr>
+        <w:pict w14:anchorId="761CE149">
+          <v:rect id="_x0000_i1027" style="width:0;height:1.5pt" o:hralign="center" o:hrstd="t" o:hr="t" fillcolor="#a0a0a0" stroked="f"/>
         </w:pict>
       </w:r>
     </w:p>
@@ -663,23 +787,22 @@
           <w:i/>
           <w:iCs/>
         </w:rPr>
-        <w:lastRenderedPageBreak/>
-        <w:t>Model Evaluation Process</w:t>
-      </w:r>
-    </w:p>
-    <w:p>
-      <w:pPr>
-        <w:rPr>
-          <w:i/>
-          <w:iCs/>
-        </w:rPr>
-      </w:pPr>
-      <w:r>
-        <w:rPr>
-          <w:i/>
-          <w:iCs/>
-        </w:rPr>
-        <w:t xml:space="preserve">Evaluating the trained models requires a thoughtful approach, particularly when dealing with imbalanced data. Simple accuracy is often insufficient, as it can be misleading in cases where the majority class dominates the dataset. Instead, the evaluation process should include metrics like </w:t>
+        <w:t>Testing and Validation Results</w:t>
+      </w:r>
+    </w:p>
+    <w:p>
+      <w:pPr>
+        <w:rPr>
+          <w:i/>
+          <w:iCs/>
+        </w:rPr>
+      </w:pPr>
+      <w:r>
+        <w:rPr>
+          <w:i/>
+          <w:iCs/>
+        </w:rPr>
+        <w:t xml:space="preserve">Testing ensures that the implemented pipeline runs successfully, while validation assesses the model's performance on unseen data. This typically involves splitting the data into training and testing sets. Given the inherent class imbalance in fraud detection tasks, relying solely on accuracy as a performance measure can be misleading. Instead, more comprehensive metrics like </w:t>
       </w:r>
       <w:r>
         <w:rPr>
@@ -743,6 +866,22 @@
           <w:i/>
           <w:iCs/>
         </w:rPr>
+        <w:t xml:space="preserve">, </w:t>
+      </w:r>
+      <w:r>
+        <w:rPr>
+          <w:b/>
+          <w:bCs/>
+          <w:i/>
+          <w:iCs/>
+        </w:rPr>
+        <w:t>ROC AUC (Receiver Operating Characteristic Area Under the Curve)</w:t>
+      </w:r>
+      <w:r>
+        <w:rPr>
+          <w:i/>
+          <w:iCs/>
+        </w:rPr>
         <w:t xml:space="preserve">, and </w:t>
       </w:r>
       <w:r>
@@ -752,236 +891,6 @@
           <w:i/>
           <w:iCs/>
         </w:rPr>
-        <w:t>ROC AUC (Receiver Operating Characteristic Area Under the Curve)</w:t>
-      </w:r>
-      <w:r>
-        <w:rPr>
-          <w:i/>
-          <w:iCs/>
-        </w:rPr>
-        <w:t>. These metrics provide a more comprehensive understanding of the model’s performance, capturing both the ability to identify positive cases (fraud) and the trade-off between precision and recall.</w:t>
-      </w:r>
-    </w:p>
-    <w:p>
-      <w:pPr>
-        <w:rPr>
-          <w:i/>
-          <w:iCs/>
-        </w:rPr>
-      </w:pPr>
-      <w:r>
-        <w:rPr>
-          <w:i/>
-          <w:iCs/>
-        </w:rPr>
-        <w:t xml:space="preserve">The evaluation code should generate these metrics based on predictions made on the test set and include visual aids like </w:t>
-      </w:r>
-      <w:r>
-        <w:rPr>
-          <w:b/>
-          <w:bCs/>
-          <w:i/>
-          <w:iCs/>
-        </w:rPr>
-        <w:t>ROC curves</w:t>
-      </w:r>
-      <w:r>
-        <w:rPr>
-          <w:i/>
-          <w:iCs/>
-        </w:rPr>
-        <w:t xml:space="preserve"> and </w:t>
-      </w:r>
-      <w:r>
-        <w:rPr>
-          <w:b/>
-          <w:bCs/>
-          <w:i/>
-          <w:iCs/>
-        </w:rPr>
-        <w:t>Precision-Recall curves</w:t>
-      </w:r>
-      <w:r>
-        <w:rPr>
-          <w:i/>
-          <w:iCs/>
-        </w:rPr>
-        <w:t xml:space="preserve"> to illustrate model performance more effectively. This approach not only demonstrates the model’s predictive power but also provides insights into potential overfitting, underfitting, and overall generalization capability.</w:t>
-      </w:r>
-      <w:r>
-        <w:rPr>
-          <w:i/>
-          <w:iCs/>
-        </w:rPr>
-        <w:br/>
-      </w:r>
-      <w:r>
-        <w:rPr>
-          <w:i/>
-          <w:iCs/>
-        </w:rPr>
-        <w:br/>
-      </w:r>
-      <w:r>
-        <w:rPr>
-          <w:b/>
-          <w:bCs/>
-          <w:i/>
-          <w:iCs/>
-        </w:rPr>
-        <w:t>Pipeline Orchestration Logic</w:t>
-      </w:r>
-    </w:p>
-    <w:p>
-      <w:pPr>
-        <w:rPr>
-          <w:i/>
-          <w:iCs/>
-        </w:rPr>
-      </w:pPr>
-      <w:r>
-        <w:rPr>
-          <w:i/>
-          <w:iCs/>
-        </w:rPr>
-        <w:t>The pipeline orchestration logic defines the sequence of steps required to build a complete machine learning pipeline, including data loading, cleaning, feature engineering, model training, and evaluation. This is typically implemented in Python scripts, with an emphasis on clean code practices to ensure readability, reusability, and maintainability. Using functions and classes is highly recommended to improve code organization, reduce duplication, and facilitate testing. This approach makes the codebase easier to extend and debug, which is essential for real-world machine learning applications.</w:t>
-      </w:r>
-    </w:p>
-    <w:p>
-      <w:pPr>
-        <w:rPr>
-          <w:i/>
-          <w:iCs/>
-        </w:rPr>
-      </w:pPr>
-      <w:r>
-        <w:rPr>
-          <w:i/>
-          <w:iCs/>
-        </w:rPr>
-        <w:pict w14:anchorId="761CE149">
-          <v:rect id="_x0000_i1047" style="width:0;height:1.5pt" o:hralign="center" o:hrstd="t" o:hr="t" fillcolor="#a0a0a0" stroked="f"/>
-        </w:pict>
-      </w:r>
-    </w:p>
-    <w:p>
-      <w:pPr>
-        <w:rPr>
-          <w:i/>
-          <w:iCs/>
-        </w:rPr>
-      </w:pPr>
-      <w:r>
-        <w:rPr>
-          <w:b/>
-          <w:bCs/>
-          <w:i/>
-          <w:iCs/>
-        </w:rPr>
-        <w:t>Testing and Validation Results</w:t>
-      </w:r>
-    </w:p>
-    <w:p>
-      <w:pPr>
-        <w:rPr>
-          <w:i/>
-          <w:iCs/>
-        </w:rPr>
-      </w:pPr>
-      <w:r>
-        <w:rPr>
-          <w:i/>
-          <w:iCs/>
-        </w:rPr>
-        <w:t xml:space="preserve">Testing ensures that the implemented pipeline runs successfully, while validation assesses the model's performance on unseen data. This typically involves splitting the data into training and testing sets. Given the inherent class imbalance in fraud detection tasks, relying solely on accuracy as a performance measure can be misleading. Instead, more comprehensive metrics like </w:t>
-      </w:r>
-      <w:r>
-        <w:rPr>
-          <w:b/>
-          <w:bCs/>
-          <w:i/>
-          <w:iCs/>
-        </w:rPr>
-        <w:t>Precision</w:t>
-      </w:r>
-      <w:r>
-        <w:rPr>
-          <w:i/>
-          <w:iCs/>
-        </w:rPr>
-        <w:t xml:space="preserve">, </w:t>
-      </w:r>
-      <w:r>
-        <w:rPr>
-          <w:b/>
-          <w:bCs/>
-          <w:i/>
-          <w:iCs/>
-        </w:rPr>
-        <w:t>Recall</w:t>
-      </w:r>
-      <w:r>
-        <w:rPr>
-          <w:i/>
-          <w:iCs/>
-        </w:rPr>
-        <w:t xml:space="preserve">, </w:t>
-      </w:r>
-      <w:r>
-        <w:rPr>
-          <w:b/>
-          <w:bCs/>
-          <w:i/>
-          <w:iCs/>
-        </w:rPr>
-        <w:t>F1-Score</w:t>
-      </w:r>
-      <w:r>
-        <w:rPr>
-          <w:i/>
-          <w:iCs/>
-        </w:rPr>
-        <w:t xml:space="preserve">, </w:t>
-      </w:r>
-      <w:r>
-        <w:rPr>
-          <w:b/>
-          <w:bCs/>
-          <w:i/>
-          <w:iCs/>
-        </w:rPr>
-        <w:t>Confusion Matrix</w:t>
-      </w:r>
-      <w:r>
-        <w:rPr>
-          <w:i/>
-          <w:iCs/>
-        </w:rPr>
-        <w:t xml:space="preserve">, </w:t>
-      </w:r>
-      <w:r>
-        <w:rPr>
-          <w:b/>
-          <w:bCs/>
-          <w:i/>
-          <w:iCs/>
-        </w:rPr>
-        <w:t>ROC AUC (Receiver Operating Characteristic Area Under the Curve)</w:t>
-      </w:r>
-      <w:r>
-        <w:rPr>
-          <w:i/>
-          <w:iCs/>
-        </w:rPr>
-        <w:t xml:space="preserve">, and </w:t>
-      </w:r>
-      <w:r>
-        <w:rPr>
-          <w:b/>
-          <w:bCs/>
-          <w:i/>
-          <w:iCs/>
-        </w:rPr>
         <w:t>Precision-Recall AUC</w:t>
       </w:r>
       <w:r>
@@ -1020,23 +929,7 @@
           <w:i/>
           <w:iCs/>
         </w:rPr>
-        <w:t>), the validation results for a model predicting "Scam Call" (</w:t>
-      </w:r>
-      <w:proofErr w:type="spellStart"/>
-      <w:r>
-        <w:rPr>
-          <w:i/>
-          <w:iCs/>
-        </w:rPr>
-        <w:t>labeled</w:t>
-      </w:r>
-      <w:proofErr w:type="spellEnd"/>
-      <w:r>
-        <w:rPr>
-          <w:i/>
-          <w:iCs/>
-        </w:rPr>
-        <w:t xml:space="preserve"> as class </w:t>
+        <w:t xml:space="preserve">), the validation results for a model predicting "Scam Call" (labeled as class </w:t>
       </w:r>
       <w:r>
         <w:rPr>
@@ -1494,7 +1387,6 @@
         </w:rPr>
         <w:t xml:space="preserve">: Creation and management of model artifacts, including trained models, performance metrics, and evaluation visuals, using tools like </w:t>
       </w:r>
-      <w:proofErr w:type="spellStart"/>
       <w:r>
         <w:rPr>
           <w:b/>
@@ -1504,7 +1396,6 @@
         </w:rPr>
         <w:t>MLflow</w:t>
       </w:r>
-      <w:proofErr w:type="spellEnd"/>
       <w:r>
         <w:rPr>
           <w:i/>
@@ -1542,7 +1433,7 @@
           <w:iCs/>
         </w:rPr>
         <w:pict w14:anchorId="225E6182">
-          <v:rect id="_x0000_i1103" style="width:0;height:1.5pt" o:hralign="center" o:hrstd="t" o:hr="t" fillcolor="#a0a0a0" stroked="f"/>
+          <v:rect id="_x0000_i1028" style="width:0;height:1.5pt" o:hralign="center" o:hrstd="t" o:hr="t" fillcolor="#a0a0a0" stroked="f"/>
         </w:pict>
       </w:r>
     </w:p>
@@ -1603,23 +1494,7 @@
           <w:i/>
           <w:iCs/>
         </w:rPr>
-        <w:t xml:space="preserve">: </w:t>
-      </w:r>
-      <w:proofErr w:type="spellStart"/>
-      <w:r>
-        <w:rPr>
-          <w:i/>
-          <w:iCs/>
-        </w:rPr>
-        <w:t>Countplots</w:t>
-      </w:r>
-      <w:proofErr w:type="spellEnd"/>
-      <w:r>
-        <w:rPr>
-          <w:i/>
-          <w:iCs/>
-        </w:rPr>
-        <w:t xml:space="preserve"> to display the distribution of categorical variables, such as the proportion of "Scam Call" versus "Not Scam," and box plots to identify potential outliers in numerical features like call duration or transaction amount.</w:t>
+        <w:t>: Countplots to display the distribution of categorical variables, such as the proportion of "Scam Call" versus "Not Scam," and box plots to identify potential outliers in numerical features like call duration or transaction amount.</w:t>
       </w:r>
     </w:p>
     <w:p>
@@ -1711,7 +1586,7 @@
           <w:iCs/>
         </w:rPr>
         <w:pict w14:anchorId="19CF8734">
-          <v:rect id="_x0000_i1104" style="width:0;height:1.5pt" o:hralign="center" o:hrstd="t" o:hr="t" fillcolor="#a0a0a0" stroked="f"/>
+          <v:rect id="_x0000_i1029" style="width:0;height:1.5pt" o:hralign="center" o:hrstd="t" o:hr="t" fillcolor="#a0a0a0" stroked="f"/>
         </w:pict>
       </w:r>
     </w:p>
@@ -1900,23 +1775,7 @@
           <w:i/>
           <w:iCs/>
         </w:rPr>
-        <w:t xml:space="preserve">: Integrating multiple tools (e.g., Kafka, Spark, Airflow, </w:t>
-      </w:r>
-      <w:proofErr w:type="spellStart"/>
-      <w:r>
-        <w:rPr>
-          <w:i/>
-          <w:iCs/>
-        </w:rPr>
-        <w:t>MLflow</w:t>
-      </w:r>
-      <w:proofErr w:type="spellEnd"/>
-      <w:r>
-        <w:rPr>
-          <w:i/>
-          <w:iCs/>
-        </w:rPr>
-        <w:t>, MinIO, Docker) to create a seamless, real-time pipeline can be challenging, requiring careful dependency management, environment setup, and debugging.</w:t>
+        <w:t>: Integrating multiple tools (e.g., Kafka, Spark, Airflow, MLflow, MinIO, Docker) to create a seamless, real-time pipeline can be challenging, requiring careful dependency management, environment setup, and debugging.</w:t>
       </w:r>
     </w:p>
     <w:p>
@@ -1988,7 +1847,7 @@
           <w:iCs/>
         </w:rPr>
         <w:pict w14:anchorId="49829A9A">
-          <v:rect id="_x0000_i1105" style="width:0;height:1.5pt" o:hralign="center" o:hrstd="t" o:hr="t" fillcolor="#a0a0a0" stroked="f"/>
+          <v:rect id="_x0000_i1030" style="width:0;height:1.5pt" o:hralign="center" o:hrstd="t" o:hr="t" fillcolor="#a0a0a0" stroked="f"/>
         </w:pict>
       </w:r>
     </w:p>
@@ -2160,7 +2019,6 @@
         </w:rPr>
         <w:t xml:space="preserve"> for pipeline orchestration, </w:t>
       </w:r>
-      <w:proofErr w:type="spellStart"/>
       <w:r>
         <w:rPr>
           <w:b/>
@@ -2170,7 +2028,6 @@
         </w:rPr>
         <w:t>MLflow</w:t>
       </w:r>
-      <w:proofErr w:type="spellEnd"/>
       <w:r>
         <w:rPr>
           <w:i/>
@@ -2266,7 +2123,6 @@
         </w:rPr>
         <w:t xml:space="preserve">: Multiple algorithms were tested to identify the best-performing model, with hyperparameter tuning used to refine model accuracy. Experiment tracking in </w:t>
       </w:r>
-      <w:proofErr w:type="spellStart"/>
       <w:r>
         <w:rPr>
           <w:b/>
@@ -2276,7 +2132,6 @@
         </w:rPr>
         <w:t>MLflow</w:t>
       </w:r>
-      <w:proofErr w:type="spellEnd"/>
       <w:r>
         <w:rPr>
           <w:i/>
@@ -2534,64 +2389,21 @@
           <w:iCs/>
         </w:rPr>
       </w:pPr>
-      <w:proofErr w:type="spellStart"/>
-      <w:r>
-        <w:rPr>
-          <w:b/>
-          <w:bCs/>
-          <w:i/>
-          <w:iCs/>
-        </w:rPr>
-        <w:t>MLOps</w:t>
-      </w:r>
-      <w:proofErr w:type="spellEnd"/>
-      <w:r>
-        <w:rPr>
-          <w:b/>
-          <w:bCs/>
-          <w:i/>
-          <w:iCs/>
-        </w:rPr>
-        <w:t xml:space="preserve"> Integration</w:t>
-      </w:r>
-      <w:r>
-        <w:rPr>
-          <w:i/>
-          <w:iCs/>
-        </w:rPr>
-        <w:t xml:space="preserve">: Developed the solution using standard tools and libraries common in the </w:t>
-      </w:r>
-      <w:proofErr w:type="spellStart"/>
-      <w:r>
-        <w:rPr>
-          <w:i/>
-          <w:iCs/>
-        </w:rPr>
-        <w:t>MLOps</w:t>
-      </w:r>
-      <w:proofErr w:type="spellEnd"/>
-      <w:r>
-        <w:rPr>
-          <w:i/>
-          <w:iCs/>
-        </w:rPr>
-        <w:t xml:space="preserve"> ecosystem, potentially leveraging technologies like Kafka for data ingestion, Airflow for workflow orchestration, Spark for data processing, </w:t>
-      </w:r>
-      <w:proofErr w:type="spellStart"/>
-      <w:r>
-        <w:rPr>
-          <w:i/>
-          <w:iCs/>
-        </w:rPr>
-        <w:t>MLflow</w:t>
-      </w:r>
-      <w:proofErr w:type="spellEnd"/>
-      <w:r>
-        <w:rPr>
-          <w:i/>
-          <w:iCs/>
-        </w:rPr>
-        <w:t xml:space="preserve"> for experiment tracking, and MinIO for data storage, as discussed in the sources.</w:t>
+      <w:r>
+        <w:rPr>
+          <w:b/>
+          <w:bCs/>
+          <w:i/>
+          <w:iCs/>
+        </w:rPr>
+        <w:t>MLOps Integration</w:t>
+      </w:r>
+      <w:r>
+        <w:rPr>
+          <w:i/>
+          <w:iCs/>
+        </w:rPr>
+        <w:t>: Developed the solution using standard tools and libraries common in the MLOps ecosystem, potentially leveraging technologies like Kafka for data ingestion, Airflow for workflow orchestration, Spark for data processing, MLflow for experiment tracking, and MinIO for data storage, as discussed in the sources.</w:t>
       </w:r>
     </w:p>
     <w:p>
@@ -2607,7 +2419,7 @@
           <w:iCs/>
         </w:rPr>
         <w:pict w14:anchorId="66D5CE68">
-          <v:rect id="_x0000_i1121" style="width:0;height:1.5pt" o:hralign="center" o:hrstd="t" o:hr="t" fillcolor="#a0a0a0" stroked="f"/>
+          <v:rect id="_x0000_i1031" style="width:0;height:1.5pt" o:hralign="center" o:hrstd="t" o:hr="t" fillcolor="#a0a0a0" stroked="f"/>
         </w:pict>
       </w:r>
     </w:p>
@@ -2697,23 +2509,7 @@
           <w:i/>
           <w:iCs/>
         </w:rPr>
-        <w:t xml:space="preserve">: Develop more sophisticated temporal or </w:t>
-      </w:r>
-      <w:proofErr w:type="spellStart"/>
-      <w:r>
-        <w:rPr>
-          <w:i/>
-          <w:iCs/>
-        </w:rPr>
-        <w:t>behavioral</w:t>
-      </w:r>
-      <w:proofErr w:type="spellEnd"/>
-      <w:r>
-        <w:rPr>
-          <w:i/>
-          <w:iCs/>
-        </w:rPr>
-        <w:t xml:space="preserve"> features based on deeper domain insights to improve predictive power.</w:t>
+        <w:t>: Develop more sophisticated temporal or behavioral features based on deeper domain insights to improve predictive power.</w:t>
       </w:r>
     </w:p>
     <w:p>
@@ -2741,23 +2537,7 @@
           <w:i/>
           <w:iCs/>
         </w:rPr>
-        <w:t xml:space="preserve">: Investigate additional methods like </w:t>
-      </w:r>
-      <w:proofErr w:type="spellStart"/>
-      <w:r>
-        <w:rPr>
-          <w:i/>
-          <w:iCs/>
-        </w:rPr>
-        <w:t>undersampling</w:t>
-      </w:r>
-      <w:proofErr w:type="spellEnd"/>
-      <w:r>
-        <w:rPr>
-          <w:i/>
-          <w:iCs/>
-        </w:rPr>
-        <w:t xml:space="preserve"> the majority class, cost-sensitive learning, or more advanced synthetic data generation techniques beyond SMOTE.</w:t>
+        <w:t>: Investigate additional methods like undersampling the majority class, cost-sensitive learning, or more advanced synthetic data generation techniques beyond SMOTE.</w:t>
       </w:r>
     </w:p>
     <w:p>
@@ -2843,7 +2623,6 @@
         </w:rPr>
         <w:t xml:space="preserve">: Integrate the trained model into a production environment using frameworks like </w:t>
       </w:r>
-      <w:proofErr w:type="spellStart"/>
       <w:r>
         <w:rPr>
           <w:b/>
@@ -2853,7 +2632,6 @@
         </w:rPr>
         <w:t>FastAPI</w:t>
       </w:r>
-      <w:proofErr w:type="spellEnd"/>
       <w:r>
         <w:rPr>
           <w:i/>
@@ -2900,19 +2678,8 @@
           <w:i/>
           <w:iCs/>
         </w:rPr>
-        <w:t xml:space="preserve">AWS </w:t>
-      </w:r>
-      <w:proofErr w:type="spellStart"/>
-      <w:r>
-        <w:rPr>
-          <w:b/>
-          <w:bCs/>
-          <w:i/>
-          <w:iCs/>
-        </w:rPr>
-        <w:t>SageMaker</w:t>
-      </w:r>
-      <w:proofErr w:type="spellEnd"/>
+        <w:t>AWS SageMaker</w:t>
+      </w:r>
       <w:r>
         <w:rPr>
           <w:i/>
@@ -2971,47 +2738,7 @@
           <w:i/>
           <w:iCs/>
         </w:rPr>
-        <w:t>SHAP (</w:t>
-      </w:r>
-      <w:proofErr w:type="spellStart"/>
-      <w:r>
-        <w:rPr>
-          <w:b/>
-          <w:bCs/>
-          <w:i/>
-          <w:iCs/>
-        </w:rPr>
-        <w:t>SHapley</w:t>
-      </w:r>
-      <w:proofErr w:type="spellEnd"/>
-      <w:r>
-        <w:rPr>
-          <w:b/>
-          <w:bCs/>
-          <w:i/>
-          <w:iCs/>
-        </w:rPr>
-        <w:t xml:space="preserve"> Additive </w:t>
-      </w:r>
-      <w:proofErr w:type="spellStart"/>
-      <w:r>
-        <w:rPr>
-          <w:b/>
-          <w:bCs/>
-          <w:i/>
-          <w:iCs/>
-        </w:rPr>
-        <w:t>exPlanations</w:t>
-      </w:r>
-      <w:proofErr w:type="spellEnd"/>
-      <w:r>
-        <w:rPr>
-          <w:b/>
-          <w:bCs/>
-          <w:i/>
-          <w:iCs/>
-        </w:rPr>
-        <w:t>)</w:t>
+        <w:t>SHAP (SHapley Additive exPlanations)</w:t>
       </w:r>
       <w:r>
         <w:rPr>
@@ -3062,7 +2789,7 @@
           <w:iCs/>
         </w:rPr>
         <w:pict w14:anchorId="335C6A69">
-          <v:rect id="_x0000_i1122" style="width:0;height:1.5pt" o:hralign="center" o:hrstd="t" o:hr="t" fillcolor="#a0a0a0" stroked="f"/>
+          <v:rect id="_x0000_i1032" style="width:0;height:1.5pt" o:hralign="center" o:hrstd="t" o:hr="t" fillcolor="#a0a0a0" stroked="f"/>
         </w:pict>
       </w:r>
     </w:p>
@@ -3455,23 +3182,7 @@
           <w:i/>
           <w:iCs/>
         </w:rPr>
-        <w:t xml:space="preserve">: Algorithms like Random Forest, Gradient Boosting, </w:t>
-      </w:r>
-      <w:proofErr w:type="spellStart"/>
-      <w:r>
-        <w:rPr>
-          <w:i/>
-          <w:iCs/>
-        </w:rPr>
-        <w:t>XGBoost</w:t>
-      </w:r>
-      <w:proofErr w:type="spellEnd"/>
-      <w:r>
-        <w:rPr>
-          <w:i/>
-          <w:iCs/>
-        </w:rPr>
-        <w:t>, and SVM are preferred for their robustness and ability to capture complex, nonlinear patterns.</w:t>
+        <w:t>: Algorithms like Random Forest, Gradient Boosting, XGBoost, and SVM are preferred for their robustness and ability to capture complex, nonlinear patterns.</w:t>
       </w:r>
     </w:p>
     <w:p>
@@ -3774,7 +3485,6 @@
         </w:rPr>
         <w:t xml:space="preserve"> for distributed data processing, </w:t>
       </w:r>
-      <w:proofErr w:type="spellStart"/>
       <w:r>
         <w:rPr>
           <w:b/>
@@ -3784,7 +3494,6 @@
         </w:rPr>
         <w:t>MLflow</w:t>
       </w:r>
-      <w:proofErr w:type="spellEnd"/>
       <w:r>
         <w:rPr>
           <w:i/>
@@ -4038,12 +3747,12 @@
       </w:r>
     </w:p>
     <w:sectPr>
-      <w:headerReference w:type="even" r:id="rId7"/>
-      <w:headerReference w:type="default" r:id="rId8"/>
-      <w:footerReference w:type="even" r:id="rId9"/>
-      <w:footerReference w:type="default" r:id="rId10"/>
-      <w:headerReference w:type="first" r:id="rId11"/>
-      <w:footerReference w:type="first" r:id="rId12"/>
+      <w:headerReference w:type="even" r:id="rId8"/>
+      <w:headerReference w:type="default" r:id="rId9"/>
+      <w:footerReference w:type="even" r:id="rId10"/>
+      <w:footerReference w:type="default" r:id="rId11"/>
+      <w:headerReference w:type="first" r:id="rId12"/>
+      <w:footerReference w:type="first" r:id="rId13"/>
       <w:pgSz w:w="11906" w:h="16838"/>
       <w:pgMar w:top="1440" w:right="1440" w:bottom="1440" w:left="1440" w:header="708" w:footer="708" w:gutter="0"/>
       <w:cols w:space="708"/>
@@ -6614,6 +6323,7 @@
   <w:style w:type="character" w:default="1" w:styleId="DefaultParagraphFont">
     <w:name w:val="Default Paragraph Font"/>
     <w:uiPriority w:val="1"/>
+    <w:semiHidden/>
     <w:unhideWhenUsed/>
   </w:style>
   <w:style w:type="table" w:default="1" w:styleId="TableNormal">

</xml_diff>